<commit_message>
Bitácora v4: numeración continua y lenguaje de la portada
Lleva al generador la versión 4 de la bitácora que iteró el equipo:
secciones 1 a 7 (antes saltaba de 1.2 a «2–8») y subcategorías 4.1 a
4.7; datos del grupo con motivo y expectativa; hasta tres instrumentos
con su relevancia; aportes a la red; patrones que pueden emerger;
conclusiones. Texto en «nosotros», revisado por el agente editor.

Contrato: bitacora.schema.json pasa a version 4. El lector sigue
reconociendo tablas y filas por su título y prueba la ida y vuelta con
el ejemplo CTeI, que se pasa a la nueva estructura. Los pasos de la
actividad nombran las secciones; ADR-0005, encuadre y metodología al día.

Co-Authored-By: Claude Opus 5.5 <noreply@anthropic.com>
Claude-Session: https://claude.ai/code/session_0139JYSGgY9xyS89Pbtyt4LD
</commit_message>
<xml_diff>
--- a/web/public/bitacora-ejemplo-ctei.docx
+++ b/web/public/bitacora-ejemplo-ctei.docx
@@ -6,6 +6,7 @@
       <w:r>
         <w:rPr>
           <w:b/>
+          <w:color w:val="3E1A63"/>
           <w:sz w:val="44"/>
         </w:rPr>
         <w:t>Bitácora de grupo</w:t>
@@ -14,15 +15,15 @@
     <w:p>
       <w:r>
         <w:rPr>
-          <w:b/>
-          <w:color w:val="4F46E5"/>
+          <w:color w:val="6941A5"/>
+          <w:sz w:val="23"/>
         </w:rPr>
         <w:t>Laboratorio de Cocreación · Una política pública, dos gobiernos</w:t>
       </w:r>
     </w:p>
     <w:p>
       <w:r>
-        <w:t>Elijan una política pública de la red y descríbanla en los dos gobiernos (2018–2022 y 2022–2026), con el informe de empalme y con información complementaria (Sinergia, el Plan Nacional de Desarrollo, el capítulo de inversión pública, normas y documentos CONPES).</w:t>
+        <w:t>Elijamos una política pública de la red y describámosla en los dos gobiernos (2018–2022 y 2022–2026). Usemos el informe de empalme (el balance que un gobierno le entrega al siguiente) y otras fuentes: Sinergia (el sistema oficial de seguimiento de metas), el Plan Nacional de Desarrollo, las leyes y los documentos CONPES (las políticas que aprueba el consejo de planeación).</w:t>
       </w:r>
     </w:p>
     <w:p>
@@ -30,19 +31,38 @@
         <w:rPr>
           <w:b/>
         </w:rPr>
-        <w:t xml:space="preserve">Regla: si la fuente no lo dice, escriban «Sin dato». </w:t>
+        <w:t xml:space="preserve">Regla 1: si la fuente no lo dice, escribamos «Sin dato». </w:t>
       </w:r>
       <w:r>
-        <w:t>Pueden aclarar el porqué: «Sin dato: el balance no lo desagrega». Un hueco de información es un hallazgo: se anota, no se rellena con supuestos. No cambien los títulos de las tablas ni de las filas, ni combinen celdas: con ellos el equipo lee la bitácora y la integra al mapa.</w:t>
+        <w:t>Podemos agregar el porqué: «Sin dato: el balance no lo desagrega». Un vacío es un hallazgo: no lo llenemos con suposiciones.</w:t>
+      </w:r>
+    </w:p>
+    <w:p>
+      <w:r>
+        <w:rPr>
+          <w:b/>
+        </w:rPr>
+        <w:t xml:space="preserve">Regla 2: no cambiemos los títulos de tablas y filas ni combinemos celdas. </w:t>
+      </w:r>
+      <w:r>
+        <w:t>Así el equipo organizador puede sumar todas las bitácoras a la red.</w:t>
       </w:r>
     </w:p>
     <w:tbl>
       <w:tblPr>
         <w:tblStyle w:val="TableGrid"/>
         <w:tblW w:type="auto" w:w="0"/>
-        <w:jc w:val="center"/>
         <w:tblLayout w:type="fixed"/>
         <w:tblLook w:firstColumn="1" w:firstRow="1" w:lastColumn="0" w:lastRow="0" w:noHBand="0" w:noVBand="1" w:val="04A0"/>
+        <w:jc w:val="center"/>
+        <w:tblBorders>
+          <w:top w:val="single" w:sz="6" w:space="0" w:color="D7CBE7"/>
+          <w:left w:val="single" w:sz="6" w:space="0" w:color="D7CBE7"/>
+          <w:bottom w:val="single" w:sz="6" w:space="0" w:color="D7CBE7"/>
+          <w:right w:val="single" w:sz="6" w:space="0" w:color="D7CBE7"/>
+          <w:insideH w:val="single" w:sz="6" w:space="0" w:color="D7CBE7"/>
+          <w:insideV w:val="single" w:sz="6" w:space="0" w:color="D7CBE7"/>
+        </w:tblBorders>
       </w:tblPr>
       <w:tblGrid>
         <w:gridCol w:w="4986"/>
@@ -50,18 +70,19 @@
       </w:tblGrid>
       <w:tr>
         <w:trPr>
-          <w:trHeight w:val="510" w:hRule="atLeast"/>
+          <w:trHeight w:val="567" w:hRule="atLeast"/>
         </w:trPr>
         <w:tc>
           <w:tcPr>
-            <w:tcW w:type="dxa" w:w="2835"/>
-            <w:shd w:val="clear" w:color="auto" w:fill="F5F5F3"/>
+            <w:tcW w:type="dxa" w:w="3402"/>
+            <w:shd w:val="clear" w:color="auto" w:fill="EEE8F7"/>
           </w:tcPr>
           <w:p>
             <w:r>
               <w:rPr>
                 <w:b/>
                 <w:i w:val="0"/>
+                <w:color w:val="3E1A63"/>
               </w:rPr>
               <w:t>Grupo</w:t>
             </w:r>
@@ -73,13 +94,13 @@
                 <w:color w:val="5D6371"/>
                 <w:sz w:val="17"/>
               </w:rPr>
-              <w:t>Nombre o número del grupo</w:t>
+              <w:t>Nombre o número</w:t>
             </w:r>
           </w:p>
         </w:tc>
         <w:tc>
           <w:tcPr>
-            <w:tcW w:type="dxa" w:w="7143"/>
+            <w:tcW w:type="dxa" w:w="6576"/>
           </w:tcPr>
           <w:p>
             <w:r>
@@ -90,18 +111,19 @@
       </w:tr>
       <w:tr>
         <w:trPr>
-          <w:trHeight w:val="510" w:hRule="atLeast"/>
+          <w:trHeight w:val="567" w:hRule="atLeast"/>
         </w:trPr>
         <w:tc>
           <w:tcPr>
-            <w:tcW w:type="dxa" w:w="2835"/>
-            <w:shd w:val="clear" w:color="auto" w:fill="F5F5F3"/>
+            <w:tcW w:type="dxa" w:w="3402"/>
+            <w:shd w:val="clear" w:color="auto" w:fill="EEE8F7"/>
           </w:tcPr>
           <w:p>
             <w:r>
               <w:rPr>
                 <w:b/>
                 <w:i w:val="0"/>
+                <w:color w:val="3E1A63"/>
               </w:rPr>
               <w:t>Integrantes</w:t>
             </w:r>
@@ -113,13 +135,13 @@
                 <w:color w:val="5D6371"/>
                 <w:sz w:val="17"/>
               </w:rPr>
-              <w:t>Separados por coma</w:t>
+              <w:t>Nombres, separados por coma</w:t>
             </w:r>
           </w:p>
         </w:tc>
         <w:tc>
           <w:tcPr>
-            <w:tcW w:type="dxa" w:w="7143"/>
+            <w:tcW w:type="dxa" w:w="6576"/>
           </w:tcPr>
           <w:p>
             <w:r>
@@ -130,20 +152,21 @@
       </w:tr>
       <w:tr>
         <w:trPr>
-          <w:trHeight w:val="510" w:hRule="atLeast"/>
+          <w:trHeight w:val="567" w:hRule="atLeast"/>
         </w:trPr>
         <w:tc>
           <w:tcPr>
-            <w:tcW w:type="dxa" w:w="2835"/>
-            <w:shd w:val="clear" w:color="auto" w:fill="F5F5F3"/>
+            <w:tcW w:type="dxa" w:w="3402"/>
+            <w:shd w:val="clear" w:color="auto" w:fill="EEE8F7"/>
           </w:tcPr>
           <w:p>
             <w:r>
               <w:rPr>
                 <w:b/>
                 <w:i w:val="0"/>
+                <w:color w:val="3E1A63"/>
               </w:rPr>
-              <w:t>Política pública (área)</w:t>
+              <w:t>Política pública</w:t>
             </w:r>
           </w:p>
           <w:p>
@@ -153,13 +176,13 @@
                 <w:color w:val="5D6371"/>
                 <w:sz w:val="17"/>
               </w:rPr>
-              <w:t>Como aparece en la red, p. ej. «Bioeconomía»</w:t>
+              <w:t>Como aparece en la red</w:t>
             </w:r>
           </w:p>
         </w:tc>
         <w:tc>
           <w:tcPr>
-            <w:tcW w:type="dxa" w:w="7143"/>
+            <w:tcW w:type="dxa" w:w="6576"/>
           </w:tcPr>
           <w:p>
             <w:r>
@@ -170,30 +193,82 @@
       </w:tr>
       <w:tr>
         <w:trPr>
-          <w:trHeight w:val="510" w:hRule="atLeast"/>
+          <w:trHeight w:val="567" w:hRule="atLeast"/>
         </w:trPr>
         <w:tc>
           <w:tcPr>
-            <w:tcW w:type="dxa" w:w="2835"/>
-            <w:shd w:val="clear" w:color="auto" w:fill="F5F5F3"/>
+            <w:tcW w:type="dxa" w:w="3402"/>
+            <w:shd w:val="clear" w:color="auto" w:fill="EEE8F7"/>
           </w:tcPr>
           <w:p>
             <w:r>
               <w:rPr>
                 <w:b/>
                 <w:i w:val="0"/>
+                <w:color w:val="3E1A63"/>
               </w:rPr>
-              <w:t>Fecha</w:t>
+              <w:t>¿Por qué elegimos esta política?</w:t>
+            </w:r>
+          </w:p>
+          <w:p>
+            <w:r>
+              <w:rPr>
+                <w:i/>
+                <w:color w:val="5D6371"/>
+                <w:sz w:val="17"/>
+              </w:rPr>
+              <w:t>Una pregunta o una razón concreta</w:t>
             </w:r>
           </w:p>
         </w:tc>
         <w:tc>
           <w:tcPr>
-            <w:tcW w:type="dxa" w:w="7143"/>
+            <w:tcW w:type="dxa" w:w="6576"/>
           </w:tcPr>
           <w:p>
             <w:r>
-              <w:t>Ejemplo</w:t>
+              <w:t>Es el sector piloto del mapa: sirve de ejemplo para las demás políticas.</w:t>
+            </w:r>
+          </w:p>
+        </w:tc>
+      </w:tr>
+      <w:tr>
+        <w:trPr>
+          <w:trHeight w:val="567" w:hRule="atLeast"/>
+        </w:trPr>
+        <w:tc>
+          <w:tcPr>
+            <w:tcW w:type="dxa" w:w="3402"/>
+            <w:shd w:val="clear" w:color="auto" w:fill="EEE8F7"/>
+          </w:tcPr>
+          <w:p>
+            <w:r>
+              <w:rPr>
+                <w:b/>
+                <w:i w:val="0"/>
+                <w:color w:val="3E1A63"/>
+              </w:rPr>
+              <w:t>¿Qué esperamos encontrar?</w:t>
+            </w:r>
+          </w:p>
+          <w:p>
+            <w:r>
+              <w:rPr>
+                <w:i/>
+                <w:color w:val="5D6371"/>
+                <w:sz w:val="17"/>
+              </w:rPr>
+              <w:t>Nuestra hipótesis inicial, antes de comparar</w:t>
+            </w:r>
+          </w:p>
+        </w:tc>
+        <w:tc>
+          <w:tcPr>
+            <w:tcW w:type="dxa" w:w="6576"/>
+          </w:tcPr>
+          <w:p>
+            <w:r>
+              <w:t>Un cambio de enfoque entre gobiernos, con instrumentos que se mantienen.</w:t>
             </w:r>
           </w:p>
         </w:tc>
@@ -203,14 +278,14 @@
       <w:pPr>
         <w:pStyle w:val="Heading1"/>
         <w:keepNext/>
-        <w:spacing w:before="320"/>
+        <w:spacing w:before="360" w:after="80"/>
       </w:pPr>
       <w:r>
         <w:rPr>
-          <w:color w:val="23262E"/>
+          <w:color w:val="4B2E83"/>
           <w:sz w:val="28"/>
         </w:rPr>
-        <w:t>1. Ubicación y avance</w:t>
+        <w:t>1. Ubicar la política</w:t>
       </w:r>
     </w:p>
     <w:p>
@@ -223,16 +298,24 @@
           <w:i/>
           <w:color w:val="5D6371"/>
         </w:rPr>
-        <w:t>Dónde está la política en el informe de cada gobierno y qué avance reporta.</w:t>
+        <w:t>Ubiquemos la política en el informe de cada gobierno y veamos cómo reporta su avance. La red puede sugerir dónde está, pero verifiquémoslo en el informe.</w:t>
       </w:r>
     </w:p>
     <w:tbl>
       <w:tblPr>
         <w:tblStyle w:val="TableGrid"/>
         <w:tblW w:type="auto" w:w="0"/>
-        <w:jc w:val="center"/>
         <w:tblLayout w:type="fixed"/>
         <w:tblLook w:firstColumn="1" w:firstRow="1" w:lastColumn="0" w:lastRow="0" w:noHBand="0" w:noVBand="1" w:val="04A0"/>
+        <w:jc w:val="center"/>
+        <w:tblBorders>
+          <w:top w:val="single" w:sz="6" w:space="0" w:color="D7CBE7"/>
+          <w:left w:val="single" w:sz="6" w:space="0" w:color="D7CBE7"/>
+          <w:bottom w:val="single" w:sz="6" w:space="0" w:color="D7CBE7"/>
+          <w:right w:val="single" w:sz="6" w:space="0" w:color="D7CBE7"/>
+          <w:insideH w:val="single" w:sz="6" w:space="0" w:color="D7CBE7"/>
+          <w:insideV w:val="single" w:sz="6" w:space="0" w:color="D7CBE7"/>
+        </w:tblBorders>
       </w:tblPr>
       <w:tblGrid>
         <w:gridCol w:w="3324"/>
@@ -246,7 +329,7 @@
         <w:tc>
           <w:tcPr>
             <w:tcW w:type="dxa" w:w="2494"/>
-            <w:shd w:val="clear" w:color="auto" w:fill="ECEAFD"/>
+            <w:shd w:val="clear" w:color="auto" w:fill="4B2E83"/>
           </w:tcPr>
           <w:p>
             <w:pPr>
@@ -256,15 +339,17 @@
               <w:rPr>
                 <w:b/>
                 <w:i w:val="0"/>
+                <w:color w:val="FFFFFF"/>
+                <w:sz w:val="18"/>
               </w:rPr>
-              <w:t>Ubicación y avance</w:t>
+              <w:t>Qué mirar</w:t>
             </w:r>
           </w:p>
         </w:tc>
         <w:tc>
           <w:tcPr>
             <w:tcW w:type="dxa" w:w="3742"/>
-            <w:shd w:val="clear" w:color="auto" w:fill="ECEAFD"/>
+            <w:shd w:val="clear" w:color="auto" w:fill="4B2E83"/>
           </w:tcPr>
           <w:p>
             <w:pPr>
@@ -274,6 +359,8 @@
               <w:rPr>
                 <w:b/>
                 <w:i w:val="0"/>
+                <w:color w:val="FFFFFF"/>
+                <w:sz w:val="18"/>
               </w:rPr>
               <w:t>2018–2022 (Duque)</w:t>
             </w:r>
@@ -282,7 +369,7 @@
         <w:tc>
           <w:tcPr>
             <w:tcW w:type="dxa" w:w="3742"/>
-            <w:shd w:val="clear" w:color="auto" w:fill="ECEAFD"/>
+            <w:shd w:val="clear" w:color="auto" w:fill="4B2E83"/>
           </w:tcPr>
           <w:p>
             <w:pPr>
@@ -292,6 +379,8 @@
               <w:rPr>
                 <w:b/>
                 <w:i w:val="0"/>
+                <w:color w:val="FFFFFF"/>
+                <w:sz w:val="18"/>
               </w:rPr>
               <w:t>2022–2026 (Petro)</w:t>
             </w:r>
@@ -301,20 +390,21 @@
       <w:tr>
         <w:trPr>
           <w:cantSplit/>
-          <w:trHeight w:val="1247" w:hRule="atLeast"/>
+          <w:trHeight w:val="1134" w:hRule="atLeast"/>
         </w:trPr>
         <w:tc>
           <w:tcPr>
             <w:tcW w:type="dxa" w:w="2494"/>
-            <w:shd w:val="clear" w:color="auto" w:fill="F5F5F3"/>
+            <w:shd w:val="clear" w:color="auto" w:fill="EEE8F7"/>
           </w:tcPr>
           <w:p>
             <w:r>
               <w:rPr>
                 <w:b/>
                 <w:i w:val="0"/>
+                <w:color w:val="3E1A63"/>
               </w:rPr>
-              <w:t>Ubicación en el documento</w:t>
+              <w:t>Ubicación</w:t>
             </w:r>
           </w:p>
           <w:p>
@@ -324,7 +414,7 @@
                 <w:color w:val="5D6371"/>
                 <w:sz w:val="17"/>
               </w:rPr>
-              <w:t>Pacto, transformación o sección del informe</w:t>
+              <w:t>Sección, capítulo o páginas</w:t>
             </w:r>
           </w:p>
         </w:tc>
@@ -352,20 +442,21 @@
       <w:tr>
         <w:trPr>
           <w:cantSplit/>
-          <w:trHeight w:val="1247" w:hRule="atLeast"/>
+          <w:trHeight w:val="1134" w:hRule="atLeast"/>
         </w:trPr>
         <w:tc>
           <w:tcPr>
             <w:tcW w:type="dxa" w:w="2494"/>
-            <w:shd w:val="clear" w:color="auto" w:fill="F5F5F3"/>
+            <w:shd w:val="clear" w:color="auto" w:fill="EEE8F7"/>
           </w:tcPr>
           <w:p>
             <w:r>
               <w:rPr>
                 <w:b/>
                 <w:i w:val="0"/>
+                <w:color w:val="3E1A63"/>
               </w:rPr>
-              <w:t>Avance reportado</w:t>
+              <w:t>Indicador o forma de reporte</w:t>
             </w:r>
           </w:p>
           <w:p>
@@ -375,7 +466,59 @@
                 <w:color w:val="5D6371"/>
                 <w:sz w:val="17"/>
               </w:rPr>
-              <w:t>¿Qué porcentaje o logro reporta?</w:t>
+              <w:t>¿Cómo muestra el avance? ¿Qué mide?</w:t>
+            </w:r>
+          </w:p>
+        </w:tc>
+        <w:tc>
+          <w:tcPr>
+            <w:tcW w:type="dxa" w:w="3742"/>
+          </w:tcPr>
+          <w:p>
+            <w:r>
+              <w:t>Porcentaje de cumplimiento del pacto en el cuatrienio.</w:t>
+            </w:r>
+          </w:p>
+        </w:tc>
+        <w:tc>
+          <w:tcPr>
+            <w:tcW w:type="dxa" w:w="3742"/>
+          </w:tcPr>
+          <w:p>
+            <w:r>
+              <w:t>No tiene indicador único: cada programa reporta sus cifras de ejecución.</w:t>
+            </w:r>
+          </w:p>
+        </w:tc>
+      </w:tr>
+      <w:tr>
+        <w:trPr>
+          <w:cantSplit/>
+          <w:trHeight w:val="1134" w:hRule="atLeast"/>
+        </w:trPr>
+        <w:tc>
+          <w:tcPr>
+            <w:tcW w:type="dxa" w:w="2494"/>
+            <w:shd w:val="clear" w:color="auto" w:fill="EEE8F7"/>
+          </w:tcPr>
+          <w:p>
+            <w:r>
+              <w:rPr>
+                <w:b/>
+                <w:i w:val="0"/>
+                <w:color w:val="3E1A63"/>
+              </w:rPr>
+              <w:t>Valor y referencia</w:t>
+            </w:r>
+          </w:p>
+          <w:p>
+            <w:r>
+              <w:rPr>
+                <w:i/>
+                <w:color w:val="5D6371"/>
+                <w:sz w:val="17"/>
+              </w:rPr>
+              <w:t>Cifra reportada y su meta, periodo o base de comparación</w:t>
             </w:r>
           </w:p>
         </w:tc>
@@ -401,27 +544,26 @@
         </w:tc>
       </w:tr>
     </w:tbl>
-    <w:p/>
     <w:p>
       <w:pPr>
-        <w:keepNext/>
-        <w:spacing w:after="120"/>
+        <w:spacing w:after="40"/>
       </w:pPr>
-      <w:r>
-        <w:rPr>
-          <w:i/>
-          <w:color w:val="5D6371"/>
-        </w:rPr>
-        <w:t>Antes de comparar cifras: ¿qué parte de un informe corresponde a qué parte del otro? ¿Miden lo mismo?</w:t>
-      </w:r>
     </w:p>
     <w:tbl>
       <w:tblPr>
         <w:tblStyle w:val="TableGrid"/>
         <w:tblW w:type="auto" w:w="0"/>
-        <w:jc w:val="center"/>
         <w:tblLayout w:type="fixed"/>
         <w:tblLook w:firstColumn="1" w:firstRow="1" w:lastColumn="0" w:lastRow="0" w:noHBand="0" w:noVBand="1" w:val="04A0"/>
+        <w:jc w:val="center"/>
+        <w:tblBorders>
+          <w:top w:val="single" w:sz="6" w:space="0" w:color="D7CBE7"/>
+          <w:left w:val="single" w:sz="6" w:space="0" w:color="D7CBE7"/>
+          <w:bottom w:val="single" w:sz="6" w:space="0" w:color="D7CBE7"/>
+          <w:right w:val="single" w:sz="6" w:space="0" w:color="D7CBE7"/>
+          <w:insideH w:val="single" w:sz="6" w:space="0" w:color="D7CBE7"/>
+          <w:insideV w:val="single" w:sz="6" w:space="0" w:color="D7CBE7"/>
+        </w:tblBorders>
       </w:tblPr>
       <w:tblGrid>
         <w:gridCol w:w="9972"/>
@@ -433,7 +575,7 @@
         <w:tc>
           <w:tcPr>
             <w:tcW w:type="dxa" w:w="9978"/>
-            <w:shd w:val="clear" w:color="auto" w:fill="ECEAFD"/>
+            <w:shd w:val="clear" w:color="auto" w:fill="4B2E83"/>
           </w:tcPr>
           <w:p>
             <w:pPr>
@@ -443,8 +585,22 @@
               <w:rPr>
                 <w:b/>
                 <w:i w:val="0"/>
+                <w:color w:val="FFFFFF"/>
               </w:rPr>
-              <w:t>Hallazgo de comparabilidad (tabla puente)</w:t>
+              <w:t>Tabla puente: ¿qué es comparable?</w:t>
+            </w:r>
+          </w:p>
+          <w:p>
+            <w:pPr>
+              <w:keepNext/>
+            </w:pPr>
+            <w:r>
+              <w:rPr>
+                <w:i/>
+                <w:color w:val="FFFFFF"/>
+                <w:sz w:val="17"/>
+              </w:rPr>
+              <w:t>¿Los dos gobiernos miden lo mismo, con la misma unidad, la misma población y la misma meta? ¿Qué no se puede comparar?</w:t>
             </w:r>
           </w:p>
         </w:tc>
@@ -452,7 +608,7 @@
       <w:tr>
         <w:trPr>
           <w:cantSplit/>
-          <w:trHeight w:val="1984" w:hRule="atLeast"/>
+          <w:trHeight w:val="2551" w:hRule="atLeast"/>
         </w:trPr>
         <w:tc>
           <w:tcPr>
@@ -468,16 +624,21 @@
     </w:tbl>
     <w:p>
       <w:pPr>
+        <w:spacing w:after="40"/>
+      </w:pPr>
+    </w:p>
+    <w:p>
+      <w:pPr>
         <w:pStyle w:val="Heading1"/>
         <w:keepNext/>
-        <w:spacing w:before="320"/>
+        <w:spacing w:before="360" w:after="80"/>
       </w:pPr>
       <w:r>
         <w:rPr>
-          <w:color w:val="23262E"/>
+          <w:color w:val="4B2E83"/>
           <w:sz w:val="28"/>
         </w:rPr>
-        <w:t>1.1 Instrumentos de política pública</w:t>
+        <w:t>2. Los instrumentos</w:t>
       </w:r>
     </w:p>
     <w:p>
@@ -490,16 +651,791 @@
           <w:i/>
           <w:color w:val="5D6371"/>
         </w:rPr>
-        <w:t>Con qué actuó el Estado en esta política. Anoten si el instrumento sigue, cambia de uso, se suma o se deja.</w:t>
+        <w:t>Escojamos hasta tres instrumentos de esta política: el medio concreto con que actúa el Estado (un programa, una ley, un fondo, una convocatoria). Describamos cada uno en los dos gobiernos: ¿sigue, cambia de uso, es nuevo o se deja? En la última columna, digamos por qué lo elegimos.</w:t>
       </w:r>
     </w:p>
     <w:tbl>
       <w:tblPr>
         <w:tblStyle w:val="TableGrid"/>
         <w:tblW w:type="auto" w:w="0"/>
-        <w:jc w:val="center"/>
         <w:tblLayout w:type="fixed"/>
         <w:tblLook w:firstColumn="1" w:firstRow="1" w:lastColumn="0" w:lastRow="0" w:noHBand="0" w:noVBand="1" w:val="04A0"/>
+        <w:jc w:val="center"/>
+        <w:tblBorders>
+          <w:top w:val="single" w:sz="6" w:space="0" w:color="D7CBE7"/>
+          <w:left w:val="single" w:sz="6" w:space="0" w:color="D7CBE7"/>
+          <w:bottom w:val="single" w:sz="6" w:space="0" w:color="D7CBE7"/>
+          <w:right w:val="single" w:sz="6" w:space="0" w:color="D7CBE7"/>
+          <w:insideH w:val="single" w:sz="6" w:space="0" w:color="D7CBE7"/>
+          <w:insideV w:val="single" w:sz="6" w:space="0" w:color="D7CBE7"/>
+        </w:tblBorders>
+      </w:tblPr>
+      <w:tblGrid>
+        <w:gridCol w:w="2493"/>
+        <w:gridCol w:w="2493"/>
+        <w:gridCol w:w="2493"/>
+        <w:gridCol w:w="2493"/>
+      </w:tblGrid>
+      <w:tr>
+        <w:trPr>
+          <w:tblHeader/>
+        </w:trPr>
+        <w:tc>
+          <w:tcPr>
+            <w:tcW w:type="dxa" w:w="2154"/>
+            <w:shd w:val="clear" w:color="auto" w:fill="4B2E83"/>
+          </w:tcPr>
+          <w:p>
+            <w:pPr>
+              <w:keepNext/>
+            </w:pPr>
+            <w:r>
+              <w:rPr>
+                <w:b/>
+                <w:i w:val="0"/>
+                <w:color w:val="FFFFFF"/>
+                <w:sz w:val="18"/>
+              </w:rPr>
+              <w:t>Instrumento</w:t>
+            </w:r>
+          </w:p>
+        </w:tc>
+        <w:tc>
+          <w:tcPr>
+            <w:tcW w:type="dxa" w:w="2721"/>
+            <w:shd w:val="clear" w:color="auto" w:fill="4B2E83"/>
+          </w:tcPr>
+          <w:p>
+            <w:pPr>
+              <w:keepNext/>
+            </w:pPr>
+            <w:r>
+              <w:rPr>
+                <w:b/>
+                <w:i w:val="0"/>
+                <w:color w:val="FFFFFF"/>
+                <w:sz w:val="18"/>
+              </w:rPr>
+              <w:t>2018–2022 (Duque)</w:t>
+            </w:r>
+          </w:p>
+        </w:tc>
+        <w:tc>
+          <w:tcPr>
+            <w:tcW w:type="dxa" w:w="2721"/>
+            <w:shd w:val="clear" w:color="auto" w:fill="4B2E83"/>
+          </w:tcPr>
+          <w:p>
+            <w:pPr>
+              <w:keepNext/>
+            </w:pPr>
+            <w:r>
+              <w:rPr>
+                <w:b/>
+                <w:i w:val="0"/>
+                <w:color w:val="FFFFFF"/>
+                <w:sz w:val="18"/>
+              </w:rPr>
+              <w:t>2022–2026 (Petro)</w:t>
+            </w:r>
+          </w:p>
+        </w:tc>
+        <w:tc>
+          <w:tcPr>
+            <w:tcW w:type="dxa" w:w="2381"/>
+            <w:shd w:val="clear" w:color="auto" w:fill="4B2E83"/>
+          </w:tcPr>
+          <w:p>
+            <w:pPr>
+              <w:keepNext/>
+            </w:pPr>
+            <w:r>
+              <w:rPr>
+                <w:b/>
+                <w:i w:val="0"/>
+                <w:color w:val="FFFFFF"/>
+                <w:sz w:val="18"/>
+              </w:rPr>
+              <w:t>Por qué es relevante</w:t>
+            </w:r>
+          </w:p>
+        </w:tc>
+      </w:tr>
+      <w:tr>
+        <w:trPr>
+          <w:cantSplit/>
+          <w:trHeight w:val="2268" w:hRule="atLeast"/>
+        </w:trPr>
+        <w:tc>
+          <w:tcPr>
+            <w:tcW w:type="dxa" w:w="2154"/>
+            <w:shd w:val="clear" w:color="auto" w:fill="EEE8F7"/>
+          </w:tcPr>
+          <w:p>
+            <w:r>
+              <w:rPr>
+                <w:b/>
+                <w:i w:val="0"/>
+                <w:color w:val="3E1A63"/>
+              </w:rPr>
+              <w:t>Instrumento 1</w:t>
+            </w:r>
+          </w:p>
+          <w:p>
+            <w:r>
+              <w:rPr>
+                <w:i/>
+                <w:color w:val="5D6371"/>
+                <w:sz w:val="17"/>
+              </w:rPr>
+              <w:t>Nombre:</w:t>
+            </w:r>
+          </w:p>
+          <w:p>
+            <w:r>
+              <w:t>Beneficios tributarios para CTeI (cupo de inversión)</w:t>
+            </w:r>
+          </w:p>
+        </w:tc>
+        <w:tc>
+          <w:tcPr>
+            <w:tcW w:type="dxa" w:w="2721"/>
+          </w:tcPr>
+          <w:p>
+            <w:r>
+              <w:t>Instrumento central: $6,50 billones aprobados en cupo de deducción y descuento tributario para empresas que invierten en I+D.</w:t>
+            </w:r>
+          </w:p>
+        </w:tc>
+        <w:tc>
+          <w:tcPr>
+            <w:tcW w:type="dxa" w:w="2721"/>
+          </w:tcPr>
+          <w:p>
+            <w:r>
+              <w:t>Se menciona el fortalecimiento de los beneficios tributarios para I+D, sin cifra propia.</w:t>
+            </w:r>
+          </w:p>
+        </w:tc>
+        <w:tc>
+          <w:tcPr>
+            <w:tcW w:type="dxa" w:w="2381"/>
+          </w:tcPr>
+          <w:p>
+            <w:r>
+              <w:t>Es el instrumento de tesoro con más recursos reportados del sector.</w:t>
+            </w:r>
+          </w:p>
+        </w:tc>
+      </w:tr>
+      <w:tr>
+        <w:trPr>
+          <w:cantSplit/>
+          <w:trHeight w:val="2268" w:hRule="atLeast"/>
+        </w:trPr>
+        <w:tc>
+          <w:tcPr>
+            <w:tcW w:type="dxa" w:w="2154"/>
+            <w:shd w:val="clear" w:color="auto" w:fill="EEE8F7"/>
+          </w:tcPr>
+          <w:p>
+            <w:r>
+              <w:rPr>
+                <w:b/>
+                <w:i w:val="0"/>
+                <w:color w:val="3E1A63"/>
+              </w:rPr>
+              <w:t>Instrumento 2</w:t>
+            </w:r>
+          </w:p>
+          <w:p>
+            <w:r>
+              <w:rPr>
+                <w:i/>
+                <w:color w:val="5D6371"/>
+                <w:sz w:val="17"/>
+              </w:rPr>
+              <w:t>Nombre:</w:t>
+            </w:r>
+          </w:p>
+          <w:p>
+            <w:r>
+              <w:t>Formación de talento</w:t>
+            </w:r>
+          </w:p>
+        </w:tc>
+        <w:tc>
+          <w:tcPr>
+            <w:tcW w:type="dxa" w:w="2721"/>
+          </w:tcPr>
+          <w:p>
+            <w:r>
+              <w:t>Becas y créditos-beca para estudios doctorales (Colciencias y aliados).</w:t>
+            </w:r>
+          </w:p>
+        </w:tc>
+        <w:tc>
+          <w:tcPr>
+            <w:tcW w:type="dxa" w:w="2721"/>
+          </w:tcPr>
+          <w:p>
+            <w:r>
+              <w:t>Programa «Ondas en los Territorios» (formación STEM en NNA) + «Ciencia para la Paz» (jóvenes en municipios PDET).</w:t>
+            </w:r>
+          </w:p>
+        </w:tc>
+        <w:tc>
+          <w:tcPr>
+            <w:tcW w:type="dxa" w:w="2381"/>
+          </w:tcPr>
+          <w:p>
+            <w:r>
+              <w:t>Muestra un giro: de la formación doctoral a la formación temprana en los territorios.</w:t>
+            </w:r>
+          </w:p>
+        </w:tc>
+      </w:tr>
+      <w:tr>
+        <w:trPr>
+          <w:cantSplit/>
+          <w:trHeight w:val="2268" w:hRule="atLeast"/>
+        </w:trPr>
+        <w:tc>
+          <w:tcPr>
+            <w:tcW w:type="dxa" w:w="2154"/>
+            <w:shd w:val="clear" w:color="auto" w:fill="EEE8F7"/>
+          </w:tcPr>
+          <w:p>
+            <w:r>
+              <w:rPr>
+                <w:b/>
+                <w:i w:val="0"/>
+                <w:color w:val="3E1A63"/>
+              </w:rPr>
+              <w:t>Instrumento 3</w:t>
+            </w:r>
+          </w:p>
+          <w:p>
+            <w:r>
+              <w:rPr>
+                <w:i/>
+                <w:color w:val="5D6371"/>
+                <w:sz w:val="17"/>
+              </w:rPr>
+              <w:t>Nombre:</w:t>
+            </w:r>
+          </w:p>
+          <w:p>
+            <w:r>
+              <w:t>Convocatorias de financiación</w:t>
+            </w:r>
+          </w:p>
+        </w:tc>
+        <w:tc>
+          <w:tcPr>
+            <w:tcW w:type="dxa" w:w="2721"/>
+          </w:tcPr>
+          <w:p>
+            <w:r>
+              <w:t>Sin dato</w:t>
+            </w:r>
+          </w:p>
+        </w:tc>
+        <w:tc>
+          <w:tcPr>
+            <w:tcW w:type="dxa" w:w="2721"/>
+          </w:tcPr>
+          <w:p>
+            <w:r>
+              <w:t>Convocatorias de financiación: ColombIA Inteligente, ECONOVA, Ciencias Básicas y del Espacio, Océanos-Clima-Recursos Marino-Costeros, Investigación Fundamental, Fondo de Investigación en Salud (FIS).</w:t>
+            </w:r>
+          </w:p>
+        </w:tc>
+        <w:tc>
+          <w:tcPr>
+            <w:tcW w:type="dxa" w:w="2381"/>
+          </w:tcPr>
+          <w:p>
+            <w:r>
+              <w:t>Es el instrumento principal que reporta el gobierno 2022–2026.</w:t>
+            </w:r>
+          </w:p>
+        </w:tc>
+      </w:tr>
+    </w:tbl>
+    <w:p>
+      <w:pPr>
+        <w:pStyle w:val="Heading1"/>
+        <w:keepNext/>
+        <w:spacing w:before="360" w:after="80"/>
+      </w:pPr>
+      <w:r>
+        <w:rPr>
+          <w:color w:val="4B2E83"/>
+          <w:sz w:val="28"/>
+        </w:rPr>
+        <w:t>3. Co-construyamos la red</w:t>
+      </w:r>
+    </w:p>
+    <w:p>
+      <w:pPr>
+        <w:keepNext/>
+        <w:spacing w:after="120"/>
+      </w:pPr>
+      <w:r>
+        <w:rPr>
+          <w:i/>
+          <w:color w:val="5D6371"/>
+        </w:rPr>
+        <w:t>La red es una primera propuesta. Corrijamos, añadamos, conectemos o reclasifiquemos lo que haga falta, y anotemos las dudas. Si hay varios aportes del mismo tipo, agreguemos filas.</w:t>
+      </w:r>
+    </w:p>
+    <w:tbl>
+      <w:tblPr>
+        <w:tblStyle w:val="TableGrid"/>
+        <w:tblW w:type="auto" w:w="0"/>
+        <w:tblLayout w:type="fixed"/>
+        <w:tblLook w:firstColumn="1" w:firstRow="1" w:lastColumn="0" w:lastRow="0" w:noHBand="0" w:noVBand="1" w:val="04A0"/>
+        <w:jc w:val="center"/>
+        <w:tblBorders>
+          <w:top w:val="single" w:sz="6" w:space="0" w:color="D7CBE7"/>
+          <w:left w:val="single" w:sz="6" w:space="0" w:color="D7CBE7"/>
+          <w:bottom w:val="single" w:sz="6" w:space="0" w:color="D7CBE7"/>
+          <w:right w:val="single" w:sz="6" w:space="0" w:color="D7CBE7"/>
+          <w:insideH w:val="single" w:sz="6" w:space="0" w:color="D7CBE7"/>
+          <w:insideV w:val="single" w:sz="6" w:space="0" w:color="D7CBE7"/>
+        </w:tblBorders>
+      </w:tblPr>
+      <w:tblGrid>
+        <w:gridCol w:w="2493"/>
+        <w:gridCol w:w="2493"/>
+        <w:gridCol w:w="2493"/>
+        <w:gridCol w:w="2493"/>
+      </w:tblGrid>
+      <w:tr>
+        <w:trPr>
+          <w:tblHeader/>
+        </w:trPr>
+        <w:tc>
+          <w:tcPr>
+            <w:tcW w:type="dxa" w:w="2041"/>
+            <w:shd w:val="clear" w:color="auto" w:fill="4B2E83"/>
+          </w:tcPr>
+          <w:p>
+            <w:pPr>
+              <w:keepNext/>
+            </w:pPr>
+            <w:r>
+              <w:rPr>
+                <w:b/>
+                <w:i w:val="0"/>
+                <w:color w:val="FFFFFF"/>
+                <w:sz w:val="18"/>
+              </w:rPr>
+              <w:t>Tipo de aporte</w:t>
+            </w:r>
+          </w:p>
+        </w:tc>
+        <w:tc>
+          <w:tcPr>
+            <w:tcW w:type="dxa" w:w="2494"/>
+            <w:shd w:val="clear" w:color="auto" w:fill="4B2E83"/>
+          </w:tcPr>
+          <w:p>
+            <w:pPr>
+              <w:keepNext/>
+            </w:pPr>
+            <w:r>
+              <w:rPr>
+                <w:b/>
+                <w:i w:val="0"/>
+                <w:color w:val="FFFFFF"/>
+                <w:sz w:val="18"/>
+              </w:rPr>
+              <w:t>Elemento o relación</w:t>
+            </w:r>
+          </w:p>
+        </w:tc>
+        <w:tc>
+          <w:tcPr>
+            <w:tcW w:type="dxa" w:w="3061"/>
+            <w:shd w:val="clear" w:color="auto" w:fill="4B2E83"/>
+          </w:tcPr>
+          <w:p>
+            <w:pPr>
+              <w:keepNext/>
+            </w:pPr>
+            <w:r>
+              <w:rPr>
+                <w:b/>
+                <w:i w:val="0"/>
+                <w:color w:val="FFFFFF"/>
+                <w:sz w:val="18"/>
+              </w:rPr>
+              <w:t>Nuestra propuesta</w:t>
+            </w:r>
+          </w:p>
+        </w:tc>
+        <w:tc>
+          <w:tcPr>
+            <w:tcW w:type="dxa" w:w="2381"/>
+            <w:shd w:val="clear" w:color="auto" w:fill="4B2E83"/>
+          </w:tcPr>
+          <w:p>
+            <w:pPr>
+              <w:keepNext/>
+            </w:pPr>
+            <w:r>
+              <w:rPr>
+                <w:b/>
+                <w:i w:val="0"/>
+                <w:color w:val="FFFFFF"/>
+                <w:sz w:val="18"/>
+              </w:rPr>
+              <w:t>Evidencia o fuente</w:t>
+            </w:r>
+          </w:p>
+        </w:tc>
+      </w:tr>
+      <w:tr>
+        <w:trPr>
+          <w:trHeight w:val="680" w:hRule="atLeast"/>
+        </w:trPr>
+        <w:tc>
+          <w:tcPr>
+            <w:tcW w:type="dxa" w:w="2041"/>
+            <w:shd w:val="clear" w:color="auto" w:fill="EEE8F7"/>
+          </w:tcPr>
+          <w:p>
+            <w:r>
+              <w:rPr>
+                <w:b/>
+                <w:i w:val="0"/>
+                <w:color w:val="3E1A63"/>
+              </w:rPr>
+              <w:t>Corregir</w:t>
+            </w:r>
+          </w:p>
+          <w:p>
+            <w:r>
+              <w:rPr>
+                <w:i/>
+                <w:color w:val="5D6371"/>
+                <w:sz w:val="17"/>
+              </w:rPr>
+              <w:t>Un dato de la red que está mal</w:t>
+            </w:r>
+          </w:p>
+        </w:tc>
+        <w:tc>
+          <w:tcPr>
+            <w:tcW w:type="dxa" w:w="2494"/>
+          </w:tcPr>
+          <w:p/>
+        </w:tc>
+        <w:tc>
+          <w:tcPr>
+            <w:tcW w:type="dxa" w:w="3061"/>
+          </w:tcPr>
+          <w:p/>
+        </w:tc>
+        <w:tc>
+          <w:tcPr>
+            <w:tcW w:type="dxa" w:w="2381"/>
+          </w:tcPr>
+          <w:p/>
+        </w:tc>
+      </w:tr>
+      <w:tr>
+        <w:trPr>
+          <w:trHeight w:val="680" w:hRule="atLeast"/>
+        </w:trPr>
+        <w:tc>
+          <w:tcPr>
+            <w:tcW w:type="dxa" w:w="2041"/>
+            <w:shd w:val="clear" w:color="auto" w:fill="EEE8F7"/>
+          </w:tcPr>
+          <w:p>
+            <w:r>
+              <w:rPr>
+                <w:b/>
+                <w:i w:val="0"/>
+                <w:color w:val="3E1A63"/>
+              </w:rPr>
+              <w:t>Añadir</w:t>
+            </w:r>
+          </w:p>
+          <w:p>
+            <w:r>
+              <w:rPr>
+                <w:i/>
+                <w:color w:val="5D6371"/>
+                <w:sz w:val="17"/>
+              </w:rPr>
+              <w:t>Un instrumento o una política que falta</w:t>
+            </w:r>
+          </w:p>
+        </w:tc>
+        <w:tc>
+          <w:tcPr>
+            <w:tcW w:type="dxa" w:w="2494"/>
+          </w:tcPr>
+          <w:p/>
+        </w:tc>
+        <w:tc>
+          <w:tcPr>
+            <w:tcW w:type="dxa" w:w="3061"/>
+          </w:tcPr>
+          <w:p/>
+        </w:tc>
+        <w:tc>
+          <w:tcPr>
+            <w:tcW w:type="dxa" w:w="2381"/>
+          </w:tcPr>
+          <w:p/>
+        </w:tc>
+      </w:tr>
+      <w:tr>
+        <w:trPr>
+          <w:trHeight w:val="680" w:hRule="atLeast"/>
+        </w:trPr>
+        <w:tc>
+          <w:tcPr>
+            <w:tcW w:type="dxa" w:w="2041"/>
+            <w:shd w:val="clear" w:color="auto" w:fill="EEE8F7"/>
+          </w:tcPr>
+          <w:p>
+            <w:r>
+              <w:rPr>
+                <w:b/>
+                <w:i w:val="0"/>
+                <w:color w:val="3E1A63"/>
+              </w:rPr>
+              <w:t>Conectar</w:t>
+            </w:r>
+          </w:p>
+          <w:p>
+            <w:r>
+              <w:rPr>
+                <w:i/>
+                <w:color w:val="5D6371"/>
+                <w:sz w:val="17"/>
+              </w:rPr>
+              <w:t>Una relación que falta</w:t>
+            </w:r>
+          </w:p>
+        </w:tc>
+        <w:tc>
+          <w:tcPr>
+            <w:tcW w:type="dxa" w:w="2494"/>
+          </w:tcPr>
+          <w:p/>
+        </w:tc>
+        <w:tc>
+          <w:tcPr>
+            <w:tcW w:type="dxa" w:w="3061"/>
+          </w:tcPr>
+          <w:p/>
+        </w:tc>
+        <w:tc>
+          <w:tcPr>
+            <w:tcW w:type="dxa" w:w="2381"/>
+          </w:tcPr>
+          <w:p/>
+        </w:tc>
+      </w:tr>
+      <w:tr>
+        <w:trPr>
+          <w:trHeight w:val="680" w:hRule="atLeast"/>
+        </w:trPr>
+        <w:tc>
+          <w:tcPr>
+            <w:tcW w:type="dxa" w:w="2041"/>
+            <w:shd w:val="clear" w:color="auto" w:fill="EEE8F7"/>
+          </w:tcPr>
+          <w:p>
+            <w:r>
+              <w:rPr>
+                <w:b/>
+                <w:i w:val="0"/>
+                <w:color w:val="3E1A63"/>
+              </w:rPr>
+              <w:t>Reclasificar</w:t>
+            </w:r>
+          </w:p>
+          <w:p>
+            <w:r>
+              <w:rPr>
+                <w:i/>
+                <w:color w:val="5D6371"/>
+                <w:sz w:val="17"/>
+              </w:rPr>
+              <w:t>Le corresponde otro tipo de instrumento o de cambio</w:t>
+            </w:r>
+          </w:p>
+        </w:tc>
+        <w:tc>
+          <w:tcPr>
+            <w:tcW w:type="dxa" w:w="2494"/>
+          </w:tcPr>
+          <w:p/>
+        </w:tc>
+        <w:tc>
+          <w:tcPr>
+            <w:tcW w:type="dxa" w:w="3061"/>
+          </w:tcPr>
+          <w:p/>
+        </w:tc>
+        <w:tc>
+          <w:tcPr>
+            <w:tcW w:type="dxa" w:w="2381"/>
+          </w:tcPr>
+          <w:p/>
+        </w:tc>
+      </w:tr>
+      <w:tr>
+        <w:trPr>
+          <w:trHeight w:val="680" w:hRule="atLeast"/>
+        </w:trPr>
+        <w:tc>
+          <w:tcPr>
+            <w:tcW w:type="dxa" w:w="2041"/>
+            <w:shd w:val="clear" w:color="auto" w:fill="EEE8F7"/>
+          </w:tcPr>
+          <w:p>
+            <w:r>
+              <w:rPr>
+                <w:b/>
+                <w:i w:val="0"/>
+                <w:color w:val="3E1A63"/>
+              </w:rPr>
+              <w:t>Duda</w:t>
+            </w:r>
+          </w:p>
+          <w:p>
+            <w:r>
+              <w:rPr>
+                <w:i/>
+                <w:color w:val="5D6371"/>
+                <w:sz w:val="17"/>
+              </w:rPr>
+              <w:t>Algo que hay que revisar</w:t>
+            </w:r>
+          </w:p>
+        </w:tc>
+        <w:tc>
+          <w:tcPr>
+            <w:tcW w:type="dxa" w:w="2494"/>
+          </w:tcPr>
+          <w:p>
+            <w:r>
+              <w:t>Modo de cambio de los beneficios tributarios</w:t>
+            </w:r>
+          </w:p>
+        </w:tc>
+        <w:tc>
+          <w:tcPr>
+            <w:tcW w:type="dxa" w:w="3061"/>
+          </w:tcPr>
+          <w:p>
+            <w:r>
+              <w:t>Revisar si es continuidad o conversión: en 2022–2026 aparece sin cifra propia.</w:t>
+            </w:r>
+          </w:p>
+        </w:tc>
+        <w:tc>
+          <w:tcPr>
+            <w:tcW w:type="dxa" w:w="2381"/>
+          </w:tcPr>
+          <w:p>
+            <w:r>
+              <w:t>Informe de empalme 2022–2026, sección de CTeI</w:t>
+            </w:r>
+          </w:p>
+        </w:tc>
+      </w:tr>
+      <w:tr>
+        <w:trPr>
+          <w:trHeight w:val="680" w:hRule="atLeast"/>
+        </w:trPr>
+        <w:tc>
+          <w:tcPr>
+            <w:tcW w:type="dxa" w:w="2041"/>
+            <w:shd w:val="clear" w:color="auto" w:fill="EEE8F7"/>
+          </w:tcPr>
+          <w:p>
+            <w:r>
+              <w:rPr>
+                <w:b/>
+                <w:i w:val="0"/>
+                <w:color w:val="3E1A63"/>
+              </w:rPr>
+              <w:t>Otro</w:t>
+            </w:r>
+          </w:p>
+        </w:tc>
+        <w:tc>
+          <w:tcPr>
+            <w:tcW w:type="dxa" w:w="2494"/>
+          </w:tcPr>
+          <w:p/>
+        </w:tc>
+        <w:tc>
+          <w:tcPr>
+            <w:tcW w:type="dxa" w:w="3061"/>
+          </w:tcPr>
+          <w:p/>
+        </w:tc>
+        <w:tc>
+          <w:tcPr>
+            <w:tcW w:type="dxa" w:w="2381"/>
+          </w:tcPr>
+          <w:p/>
+        </w:tc>
+      </w:tr>
+    </w:tbl>
+    <w:p>
+      <w:pPr>
+        <w:pStyle w:val="Heading1"/>
+        <w:keepNext/>
+        <w:spacing w:before="360" w:after="80"/>
+      </w:pPr>
+      <w:r>
+        <w:rPr>
+          <w:color w:val="4B2E83"/>
+          <w:sz w:val="28"/>
+        </w:rPr>
+        <w:t>4. Las siete subcategorías, lado a lado</w:t>
+      </w:r>
+    </w:p>
+    <w:p>
+      <w:pPr>
+        <w:keepNext/>
+        <w:spacing w:after="120"/>
+      </w:pPr>
+      <w:r>
+        <w:rPr>
+          <w:i/>
+          <w:color w:val="5D6371"/>
+        </w:rPr>
+        <w:t>Comparemos las siete subcategorías, fila por fila. Si la fuente no lo dice, escribamos «Sin dato».</w:t>
+      </w:r>
+    </w:p>
+    <w:tbl>
+      <w:tblPr>
+        <w:tblStyle w:val="TableGrid"/>
+        <w:tblW w:type="auto" w:w="0"/>
+        <w:tblLayout w:type="fixed"/>
+        <w:tblLook w:firstColumn="1" w:firstRow="1" w:lastColumn="0" w:lastRow="0" w:noHBand="0" w:noVBand="1" w:val="04A0"/>
+        <w:jc w:val="center"/>
+        <w:tblBorders>
+          <w:top w:val="single" w:sz="6" w:space="0" w:color="D7CBE7"/>
+          <w:left w:val="single" w:sz="6" w:space="0" w:color="D7CBE7"/>
+          <w:bottom w:val="single" w:sz="6" w:space="0" w:color="D7CBE7"/>
+          <w:right w:val="single" w:sz="6" w:space="0" w:color="D7CBE7"/>
+          <w:insideH w:val="single" w:sz="6" w:space="0" w:color="D7CBE7"/>
+          <w:insideV w:val="single" w:sz="6" w:space="0" w:color="D7CBE7"/>
+        </w:tblBorders>
       </w:tblPr>
       <w:tblGrid>
         <w:gridCol w:w="3324"/>
@@ -513,7 +1449,7 @@
         <w:tc>
           <w:tcPr>
             <w:tcW w:type="dxa" w:w="2494"/>
-            <w:shd w:val="clear" w:color="auto" w:fill="ECEAFD"/>
+            <w:shd w:val="clear" w:color="auto" w:fill="4B2E83"/>
           </w:tcPr>
           <w:p>
             <w:pPr>
@@ -523,15 +1459,17 @@
               <w:rPr>
                 <w:b/>
                 <w:i w:val="0"/>
+                <w:color w:val="FFFFFF"/>
+                <w:sz w:val="18"/>
               </w:rPr>
-              <w:t>Instrumentos</w:t>
+              <w:t>Subcategoría</w:t>
             </w:r>
           </w:p>
         </w:tc>
         <w:tc>
           <w:tcPr>
             <w:tcW w:type="dxa" w:w="3742"/>
-            <w:shd w:val="clear" w:color="auto" w:fill="ECEAFD"/>
+            <w:shd w:val="clear" w:color="auto" w:fill="4B2E83"/>
           </w:tcPr>
           <w:p>
             <w:pPr>
@@ -541,6 +1479,8 @@
               <w:rPr>
                 <w:b/>
                 <w:i w:val="0"/>
+                <w:color w:val="FFFFFF"/>
+                <w:sz w:val="18"/>
               </w:rPr>
               <w:t>2018–2022 (Duque)</w:t>
             </w:r>
@@ -549,7 +1489,7 @@
         <w:tc>
           <w:tcPr>
             <w:tcW w:type="dxa" w:w="3742"/>
-            <w:shd w:val="clear" w:color="auto" w:fill="ECEAFD"/>
+            <w:shd w:val="clear" w:color="auto" w:fill="4B2E83"/>
           </w:tcPr>
           <w:p>
             <w:pPr>
@@ -559,6 +1499,8 @@
               <w:rPr>
                 <w:b/>
                 <w:i w:val="0"/>
+                <w:color w:val="FFFFFF"/>
+                <w:sz w:val="18"/>
               </w:rPr>
               <w:t>2022–2026 (Petro)</w:t>
             </w:r>
@@ -568,20 +1510,21 @@
       <w:tr>
         <w:trPr>
           <w:cantSplit/>
-          <w:trHeight w:val="1247" w:hRule="atLeast"/>
+          <w:trHeight w:val="1134" w:hRule="atLeast"/>
         </w:trPr>
         <w:tc>
           <w:tcPr>
             <w:tcW w:type="dxa" w:w="2494"/>
-            <w:shd w:val="clear" w:color="auto" w:fill="F5F5F3"/>
+            <w:shd w:val="clear" w:color="auto" w:fill="EEE8F7"/>
           </w:tcPr>
           <w:p>
             <w:r>
               <w:rPr>
                 <w:b/>
                 <w:i w:val="0"/>
+                <w:color w:val="3E1A63"/>
               </w:rPr>
-              <w:t>Instrumento principal</w:t>
+              <w:t>4.1 Objetivo</w:t>
             </w:r>
           </w:p>
           <w:p>
@@ -591,260 +1534,7 @@
                 <w:color w:val="5D6371"/>
                 <w:sz w:val="17"/>
               </w:rPr>
-              <w:t>El que más peso o recursos tiene</w:t>
-            </w:r>
-          </w:p>
-        </w:tc>
-        <w:tc>
-          <w:tcPr>
-            <w:tcW w:type="dxa" w:w="3742"/>
-          </w:tcPr>
-          <w:p>
-            <w:r>
-              <w:t>Cupo de inversión para deducción y descuento tributario en CTeI (beneficio fiscal a empresas que invierten en I+D).</w:t>
-            </w:r>
-          </w:p>
-        </w:tc>
-        <w:tc>
-          <w:tcPr>
-            <w:tcW w:type="dxa" w:w="3742"/>
-          </w:tcPr>
-          <w:p>
-            <w:r>
-              <w:t>Convocatorias de financiación: ColombIA Inteligente, ECONOVA, Ciencias Básicas y del Espacio, Océanos-Clima-Recursos Marino-Costeros, Investigación Fundamental, Fondo de Investigación en Salud (FIS).</w:t>
-            </w:r>
-          </w:p>
-        </w:tc>
-      </w:tr>
-      <w:tr>
-        <w:trPr>
-          <w:cantSplit/>
-          <w:trHeight w:val="1247" w:hRule="atLeast"/>
-        </w:trPr>
-        <w:tc>
-          <w:tcPr>
-            <w:tcW w:type="dxa" w:w="2494"/>
-            <w:shd w:val="clear" w:color="auto" w:fill="F5F5F3"/>
-          </w:tcPr>
-          <w:p>
-            <w:r>
-              <w:rPr>
-                <w:b/>
-                <w:i w:val="0"/>
-              </w:rPr>
-              <w:t>Instrumento de formación de talento</w:t>
-            </w:r>
-          </w:p>
-          <w:p>
-            <w:r>
-              <w:rPr>
-                <w:i/>
-                <w:color w:val="5D6371"/>
-                <w:sz w:val="17"/>
-              </w:rPr>
-              <w:t>Becas, formación, vocaciones</w:t>
-            </w:r>
-          </w:p>
-        </w:tc>
-        <w:tc>
-          <w:tcPr>
-            <w:tcW w:type="dxa" w:w="3742"/>
-          </w:tcPr>
-          <w:p>
-            <w:r>
-              <w:t>Becas y créditos-beca para estudios doctorales (Colciencias y aliados).</w:t>
-            </w:r>
-          </w:p>
-        </w:tc>
-        <w:tc>
-          <w:tcPr>
-            <w:tcW w:type="dxa" w:w="3742"/>
-          </w:tcPr>
-          <w:p>
-            <w:r>
-              <w:t>Programa «Ondas en los Territorios» (formación STEM en NNA) + «Ciencia para la Paz» (jóvenes en municipios PDET).</w:t>
-            </w:r>
-          </w:p>
-        </w:tc>
-      </w:tr>
-      <w:tr>
-        <w:trPr>
-          <w:cantSplit/>
-          <w:trHeight w:val="1247" w:hRule="atLeast"/>
-        </w:trPr>
-        <w:tc>
-          <w:tcPr>
-            <w:tcW w:type="dxa" w:w="2494"/>
-            <w:shd w:val="clear" w:color="auto" w:fill="F5F5F3"/>
-          </w:tcPr>
-          <w:p>
-            <w:r>
-              <w:rPr>
-                <w:b/>
-                <w:i w:val="0"/>
-              </w:rPr>
-              <w:t>Instrumento fiscal o tributario</w:t>
-            </w:r>
-          </w:p>
-          <w:p>
-            <w:r>
-              <w:rPr>
-                <w:i/>
-                <w:color w:val="5D6371"/>
-                <w:sz w:val="17"/>
-              </w:rPr>
-              <w:t>Beneficios tributarios, fondos, cupos</w:t>
-            </w:r>
-          </w:p>
-        </w:tc>
-        <w:tc>
-          <w:tcPr>
-            <w:tcW w:type="dxa" w:w="3742"/>
-          </w:tcPr>
-          <w:p>
-            <w:r>
-              <w:t>Sí: es el instrumento central reportado.</w:t>
-            </w:r>
-          </w:p>
-        </w:tc>
-        <w:tc>
-          <w:tcPr>
-            <w:tcW w:type="dxa" w:w="3742"/>
-          </w:tcPr>
-          <w:p>
-            <w:r>
-              <w:t>Se menciona el fortalecimiento de los beneficios tributarios para I+D, sin cifra propia.</w:t>
-            </w:r>
-          </w:p>
-        </w:tc>
-      </w:tr>
-    </w:tbl>
-    <w:p>
-      <w:pPr>
-        <w:pStyle w:val="Heading1"/>
-        <w:keepNext/>
-        <w:spacing w:before="320"/>
-      </w:pPr>
-      <w:r>
-        <w:rPr>
-          <w:color w:val="23262E"/>
-          <w:sz w:val="28"/>
-        </w:rPr>
-        <w:t>2–8. Las siete subcategorías, lado a lado</w:t>
-      </w:r>
-    </w:p>
-    <w:p>
-      <w:pPr>
-        <w:keepNext/>
-        <w:spacing w:after="120"/>
-      </w:pPr>
-      <w:r>
-        <w:rPr>
-          <w:i/>
-          <w:color w:val="5D6371"/>
-        </w:rPr>
-        <w:t>Lo mismo para los dos gobiernos, fila por fila. Si el informe no lo dice, escriban «Sin dato».</w:t>
-      </w:r>
-    </w:p>
-    <w:tbl>
-      <w:tblPr>
-        <w:tblStyle w:val="TableGrid"/>
-        <w:tblW w:type="auto" w:w="0"/>
-        <w:jc w:val="center"/>
-        <w:tblLayout w:type="fixed"/>
-        <w:tblLook w:firstColumn="1" w:firstRow="1" w:lastColumn="0" w:lastRow="0" w:noHBand="0" w:noVBand="1" w:val="04A0"/>
-      </w:tblPr>
-      <w:tblGrid>
-        <w:gridCol w:w="3324"/>
-        <w:gridCol w:w="3324"/>
-        <w:gridCol w:w="3324"/>
-      </w:tblGrid>
-      <w:tr>
-        <w:trPr>
-          <w:tblHeader/>
-        </w:trPr>
-        <w:tc>
-          <w:tcPr>
-            <w:tcW w:type="dxa" w:w="2494"/>
-            <w:shd w:val="clear" w:color="auto" w:fill="ECEAFD"/>
-          </w:tcPr>
-          <w:p>
-            <w:pPr>
-              <w:keepNext/>
-            </w:pPr>
-            <w:r>
-              <w:rPr>
-                <w:b/>
-                <w:i w:val="0"/>
-              </w:rPr>
-              <w:t>Subcategoría</w:t>
-            </w:r>
-          </w:p>
-        </w:tc>
-        <w:tc>
-          <w:tcPr>
-            <w:tcW w:type="dxa" w:w="3742"/>
-            <w:shd w:val="clear" w:color="auto" w:fill="ECEAFD"/>
-          </w:tcPr>
-          <w:p>
-            <w:pPr>
-              <w:keepNext/>
-            </w:pPr>
-            <w:r>
-              <w:rPr>
-                <w:b/>
-                <w:i w:val="0"/>
-              </w:rPr>
-              <w:t>2018–2022 (Duque)</w:t>
-            </w:r>
-          </w:p>
-        </w:tc>
-        <w:tc>
-          <w:tcPr>
-            <w:tcW w:type="dxa" w:w="3742"/>
-            <w:shd w:val="clear" w:color="auto" w:fill="ECEAFD"/>
-          </w:tcPr>
-          <w:p>
-            <w:pPr>
-              <w:keepNext/>
-            </w:pPr>
-            <w:r>
-              <w:rPr>
-                <w:b/>
-                <w:i w:val="0"/>
-              </w:rPr>
-              <w:t>2022–2026 (Petro)</w:t>
-            </w:r>
-          </w:p>
-        </w:tc>
-      </w:tr>
-      <w:tr>
-        <w:trPr>
-          <w:cantSplit/>
-          <w:trHeight w:val="1247" w:hRule="atLeast"/>
-        </w:trPr>
-        <w:tc>
-          <w:tcPr>
-            <w:tcW w:type="dxa" w:w="2494"/>
-            <w:shd w:val="clear" w:color="auto" w:fill="F5F5F3"/>
-          </w:tcPr>
-          <w:p>
-            <w:r>
-              <w:rPr>
-                <w:b/>
-                <w:i w:val="0"/>
-              </w:rPr>
-              <w:t>2. Objetivo</w:t>
-            </w:r>
-          </w:p>
-          <w:p>
-            <w:r>
-              <w:rPr>
-                <w:i/>
-                <w:color w:val="5D6371"/>
-                <w:sz w:val="17"/>
-              </w:rPr>
-              <w:t>¿Qué declara cada gobierno que busca?</w:t>
+              <w:t>¿Qué declara que busca?</w:t>
             </w:r>
           </w:p>
         </w:tc>
@@ -872,20 +1562,21 @@
       <w:tr>
         <w:trPr>
           <w:cantSplit/>
-          <w:trHeight w:val="1247" w:hRule="atLeast"/>
+          <w:trHeight w:val="1134" w:hRule="atLeast"/>
         </w:trPr>
         <w:tc>
           <w:tcPr>
             <w:tcW w:type="dxa" w:w="2494"/>
-            <w:shd w:val="clear" w:color="auto" w:fill="F5F5F3"/>
+            <w:shd w:val="clear" w:color="auto" w:fill="EEE8F7"/>
           </w:tcPr>
           <w:p>
             <w:r>
               <w:rPr>
                 <w:b/>
                 <w:i w:val="0"/>
+                <w:color w:val="3E1A63"/>
               </w:rPr>
-              <w:t>3. Instituciones</w:t>
+              <w:t>4.2 Instituciones</w:t>
             </w:r>
           </w:p>
           <w:p>
@@ -895,7 +1586,7 @@
                 <w:color w:val="5D6371"/>
                 <w:sz w:val="17"/>
               </w:rPr>
-              <w:t>¿Qué entidades la ejecutan o coordinan?</w:t>
+              <w:t>¿Quién la ejecuta o la coordina?</w:t>
             </w:r>
           </w:p>
         </w:tc>
@@ -923,20 +1614,21 @@
       <w:tr>
         <w:trPr>
           <w:cantSplit/>
-          <w:trHeight w:val="1247" w:hRule="atLeast"/>
+          <w:trHeight w:val="1134" w:hRule="atLeast"/>
         </w:trPr>
         <w:tc>
           <w:tcPr>
             <w:tcW w:type="dxa" w:w="2494"/>
-            <w:shd w:val="clear" w:color="auto" w:fill="F5F5F3"/>
+            <w:shd w:val="clear" w:color="auto" w:fill="EEE8F7"/>
           </w:tcPr>
           <w:p>
             <w:r>
               <w:rPr>
                 <w:b/>
                 <w:i w:val="0"/>
+                <w:color w:val="3E1A63"/>
               </w:rPr>
-              <w:t>4. Población</w:t>
+              <w:t>4.3 Población</w:t>
             </w:r>
           </w:p>
           <w:p>
@@ -946,7 +1638,7 @@
                 <w:color w:val="5D6371"/>
                 <w:sz w:val="17"/>
               </w:rPr>
-              <w:t>¿A quién va dirigida? ¿Enfoque diferencial o territorial?</w:t>
+              <w:t>¿A quién va dirigida? ¿Atiende distinto a ciertos grupos o regiones?</w:t>
             </w:r>
           </w:p>
         </w:tc>
@@ -974,20 +1666,21 @@
       <w:tr>
         <w:trPr>
           <w:cantSplit/>
-          <w:trHeight w:val="1247" w:hRule="atLeast"/>
+          <w:trHeight w:val="1134" w:hRule="atLeast"/>
         </w:trPr>
         <w:tc>
           <w:tcPr>
             <w:tcW w:type="dxa" w:w="2494"/>
-            <w:shd w:val="clear" w:color="auto" w:fill="F5F5F3"/>
+            <w:shd w:val="clear" w:color="auto" w:fill="EEE8F7"/>
           </w:tcPr>
           <w:p>
             <w:r>
               <w:rPr>
                 <w:b/>
                 <w:i w:val="0"/>
+                <w:color w:val="3E1A63"/>
               </w:rPr>
-              <w:t>5. Normativa</w:t>
+              <w:t>4.4 Normativa</w:t>
             </w:r>
           </w:p>
           <w:p>
@@ -997,7 +1690,7 @@
                 <w:color w:val="5D6371"/>
                 <w:sz w:val="17"/>
               </w:rPr>
-              <w:t>Leyes, decretos o CONPES que la sustentan</w:t>
+              <w:t>¿Qué leyes, decretos o documentos CONPES la sustentan?</w:t>
             </w:r>
           </w:p>
         </w:tc>
@@ -1025,20 +1718,21 @@
       <w:tr>
         <w:trPr>
           <w:cantSplit/>
-          <w:trHeight w:val="1247" w:hRule="atLeast"/>
+          <w:trHeight w:val="1134" w:hRule="atLeast"/>
         </w:trPr>
         <w:tc>
           <w:tcPr>
             <w:tcW w:type="dxa" w:w="2494"/>
-            <w:shd w:val="clear" w:color="auto" w:fill="F5F5F3"/>
+            <w:shd w:val="clear" w:color="auto" w:fill="EEE8F7"/>
           </w:tcPr>
           <w:p>
             <w:r>
               <w:rPr>
                 <w:b/>
                 <w:i w:val="0"/>
+                <w:color w:val="3E1A63"/>
               </w:rPr>
-              <w:t>6. Recursos</w:t>
+              <w:t>4.5 Recursos</w:t>
             </w:r>
           </w:p>
           <w:p>
@@ -1048,7 +1742,7 @@
                 <w:color w:val="5D6371"/>
                 <w:sz w:val="17"/>
               </w:rPr>
-              <w:t>¿Cuánto dinero y de qué fuente?</w:t>
+              <w:t>¿Qué recursos reporta y de qué fuente?</w:t>
             </w:r>
           </w:p>
         </w:tc>
@@ -1076,20 +1770,21 @@
       <w:tr>
         <w:trPr>
           <w:cantSplit/>
-          <w:trHeight w:val="1247" w:hRule="atLeast"/>
+          <w:trHeight w:val="1134" w:hRule="atLeast"/>
         </w:trPr>
         <w:tc>
           <w:tcPr>
             <w:tcW w:type="dxa" w:w="2494"/>
-            <w:shd w:val="clear" w:color="auto" w:fill="F5F5F3"/>
+            <w:shd w:val="clear" w:color="auto" w:fill="EEE8F7"/>
           </w:tcPr>
           <w:p>
             <w:r>
               <w:rPr>
                 <w:b/>
                 <w:i w:val="0"/>
+                <w:color w:val="3E1A63"/>
               </w:rPr>
-              <w:t>7. Metas</w:t>
+              <w:t>4.6 Metas</w:t>
             </w:r>
           </w:p>
           <w:p>
@@ -1099,7 +1794,7 @@
                 <w:color w:val="5D6371"/>
                 <w:sz w:val="17"/>
               </w:rPr>
-              <w:t>¿Qué cifras reporta y contra qué meta del cuatrienio?</w:t>
+              <w:t>¿Qué meta se fijó para el cuatrienio y cuánto cumplió?</w:t>
             </w:r>
           </w:p>
         </w:tc>
@@ -1127,20 +1822,21 @@
       <w:tr>
         <w:trPr>
           <w:cantSplit/>
-          <w:trHeight w:val="1247" w:hRule="atLeast"/>
+          <w:trHeight w:val="1134" w:hRule="atLeast"/>
         </w:trPr>
         <w:tc>
           <w:tcPr>
             <w:tcW w:type="dxa" w:w="2494"/>
-            <w:shd w:val="clear" w:color="auto" w:fill="F5F5F3"/>
+            <w:shd w:val="clear" w:color="auto" w:fill="EEE8F7"/>
           </w:tcPr>
           <w:p>
             <w:r>
               <w:rPr>
                 <w:b/>
                 <w:i w:val="0"/>
+                <w:color w:val="3E1A63"/>
               </w:rPr>
-              <w:t>8. Impacto</w:t>
+              <w:t>4.7 Impacto</w:t>
             </w:r>
           </w:p>
           <w:p>
@@ -1150,7 +1846,7 @@
                 <w:color w:val="5D6371"/>
                 <w:sz w:val="17"/>
               </w:rPr>
-              <w:t>¿Hay evidencia de impacto o solo de gestión y producto?</w:t>
+              <w:t>¿Hay pruebas de que cambió la vida de la gente, o solo de lo que se hizo y se entregó?</w:t>
             </w:r>
           </w:p>
         </w:tc>
@@ -1180,14 +1876,14 @@
       <w:pPr>
         <w:pStyle w:val="Heading1"/>
         <w:keepNext/>
-        <w:spacing w:before="320"/>
+        <w:spacing w:before="360" w:after="80"/>
       </w:pPr>
       <w:r>
         <w:rPr>
-          <w:color w:val="23262E"/>
+          <w:color w:val="4B2E83"/>
           <w:sz w:val="28"/>
         </w:rPr>
-        <w:t>Fuentes complementarias</w:t>
+        <w:t>5. Fuentes complementarias</w:t>
       </w:r>
     </w:p>
     <w:p>
@@ -1200,16 +1896,24 @@
           <w:i/>
           <w:color w:val="5D6371"/>
         </w:rPr>
-        <w:t>Lo que consultaron más allá del informe de empalme. Agreguen filas si hace falta.</w:t>
+        <w:t>Anotemos solo las fuentes distintas del informe que usamos para verificar o ampliar la comparación. Si hace falta, agreguemos filas.</w:t>
       </w:r>
     </w:p>
     <w:tbl>
       <w:tblPr>
         <w:tblStyle w:val="TableGrid"/>
         <w:tblW w:type="auto" w:w="0"/>
-        <w:jc w:val="center"/>
         <w:tblLayout w:type="fixed"/>
         <w:tblLook w:firstColumn="1" w:firstRow="1" w:lastColumn="0" w:lastRow="0" w:noHBand="0" w:noVBand="1" w:val="04A0"/>
+        <w:jc w:val="center"/>
+        <w:tblBorders>
+          <w:top w:val="single" w:sz="6" w:space="0" w:color="D7CBE7"/>
+          <w:left w:val="single" w:sz="6" w:space="0" w:color="D7CBE7"/>
+          <w:bottom w:val="single" w:sz="6" w:space="0" w:color="D7CBE7"/>
+          <w:right w:val="single" w:sz="6" w:space="0" w:color="D7CBE7"/>
+          <w:insideH w:val="single" w:sz="6" w:space="0" w:color="D7CBE7"/>
+          <w:insideV w:val="single" w:sz="6" w:space="0" w:color="D7CBE7"/>
+        </w:tblBorders>
       </w:tblPr>
       <w:tblGrid>
         <w:gridCol w:w="3324"/>
@@ -1223,7 +1927,7 @@
         <w:tc>
           <w:tcPr>
             <w:tcW w:type="dxa" w:w="3402"/>
-            <w:shd w:val="clear" w:color="auto" w:fill="ECEAFD"/>
+            <w:shd w:val="clear" w:color="auto" w:fill="4B2E83"/>
           </w:tcPr>
           <w:p>
             <w:pPr>
@@ -1233,6 +1937,8 @@
               <w:rPr>
                 <w:b/>
                 <w:i w:val="0"/>
+                <w:color w:val="FFFFFF"/>
+                <w:sz w:val="18"/>
               </w:rPr>
               <w:t>Fuente</w:t>
             </w:r>
@@ -1241,7 +1947,7 @@
         <w:tc>
           <w:tcPr>
             <w:tcW w:type="dxa" w:w="3742"/>
-            <w:shd w:val="clear" w:color="auto" w:fill="ECEAFD"/>
+            <w:shd w:val="clear" w:color="auto" w:fill="4B2E83"/>
           </w:tcPr>
           <w:p>
             <w:pPr>
@@ -1251,6 +1957,8 @@
               <w:rPr>
                 <w:b/>
                 <w:i w:val="0"/>
+                <w:color w:val="FFFFFF"/>
+                <w:sz w:val="18"/>
               </w:rPr>
               <w:t>Qué aportó</w:t>
             </w:r>
@@ -1259,7 +1967,7 @@
         <w:tc>
           <w:tcPr>
             <w:tcW w:type="dxa" w:w="2835"/>
-            <w:shd w:val="clear" w:color="auto" w:fill="ECEAFD"/>
+            <w:shd w:val="clear" w:color="auto" w:fill="4B2E83"/>
           </w:tcPr>
           <w:p>
             <w:pPr>
@@ -1269,6 +1977,8 @@
               <w:rPr>
                 <w:b/>
                 <w:i w:val="0"/>
+                <w:color w:val="FFFFFF"/>
+                <w:sz w:val="18"/>
               </w:rPr>
               <w:t>Página o enlace</w:t>
             </w:r>
@@ -1277,7 +1987,7 @@
       </w:tr>
       <w:tr>
         <w:trPr>
-          <w:trHeight w:val="567" w:hRule="atLeast"/>
+          <w:trHeight w:val="680" w:hRule="atLeast"/>
         </w:trPr>
         <w:tc>
           <w:tcPr>
@@ -1312,11 +2022,12 @@
       </w:tr>
       <w:tr>
         <w:trPr>
-          <w:trHeight w:val="567" w:hRule="atLeast"/>
+          <w:trHeight w:val="680" w:hRule="atLeast"/>
         </w:trPr>
         <w:tc>
           <w:tcPr>
             <w:tcW w:type="dxa" w:w="3402"/>
+            <w:shd w:val="clear" w:color="auto" w:fill="F7F4FB"/>
           </w:tcPr>
           <w:p>
             <w:r>
@@ -1327,6 +2038,7 @@
         <w:tc>
           <w:tcPr>
             <w:tcW w:type="dxa" w:w="3742"/>
+            <w:shd w:val="clear" w:color="auto" w:fill="F7F4FB"/>
           </w:tcPr>
           <w:p>
             <w:r>
@@ -1337,13 +2049,14 @@
         <w:tc>
           <w:tcPr>
             <w:tcW w:type="dxa" w:w="2835"/>
+            <w:shd w:val="clear" w:color="auto" w:fill="F7F4FB"/>
           </w:tcPr>
           <w:p/>
         </w:tc>
       </w:tr>
       <w:tr>
         <w:trPr>
-          <w:trHeight w:val="567" w:hRule="atLeast"/>
+          <w:trHeight w:val="680" w:hRule="atLeast"/>
         </w:trPr>
         <w:tc>
           <w:tcPr>
@@ -1366,69 +2079,26 @@
       </w:tr>
       <w:tr>
         <w:trPr>
-          <w:trHeight w:val="567" w:hRule="atLeast"/>
+          <w:trHeight w:val="680" w:hRule="atLeast"/>
         </w:trPr>
         <w:tc>
           <w:tcPr>
             <w:tcW w:type="dxa" w:w="3402"/>
+            <w:shd w:val="clear" w:color="auto" w:fill="F7F4FB"/>
           </w:tcPr>
           <w:p/>
         </w:tc>
         <w:tc>
           <w:tcPr>
             <w:tcW w:type="dxa" w:w="3742"/>
+            <w:shd w:val="clear" w:color="auto" w:fill="F7F4FB"/>
           </w:tcPr>
           <w:p/>
         </w:tc>
         <w:tc>
           <w:tcPr>
             <w:tcW w:type="dxa" w:w="2835"/>
-          </w:tcPr>
-          <w:p/>
-        </w:tc>
-      </w:tr>
-      <w:tr>
-        <w:trPr>
-          <w:trHeight w:val="567" w:hRule="atLeast"/>
-        </w:trPr>
-        <w:tc>
-          <w:tcPr>
-            <w:tcW w:type="dxa" w:w="3402"/>
-          </w:tcPr>
-          <w:p/>
-        </w:tc>
-        <w:tc>
-          <w:tcPr>
-            <w:tcW w:type="dxa" w:w="3742"/>
-          </w:tcPr>
-          <w:p/>
-        </w:tc>
-        <w:tc>
-          <w:tcPr>
-            <w:tcW w:type="dxa" w:w="2835"/>
-          </w:tcPr>
-          <w:p/>
-        </w:tc>
-      </w:tr>
-      <w:tr>
-        <w:trPr>
-          <w:trHeight w:val="567" w:hRule="atLeast"/>
-        </w:trPr>
-        <w:tc>
-          <w:tcPr>
-            <w:tcW w:type="dxa" w:w="3402"/>
-          </w:tcPr>
-          <w:p/>
-        </w:tc>
-        <w:tc>
-          <w:tcPr>
-            <w:tcW w:type="dxa" w:w="3742"/>
-          </w:tcPr>
-          <w:p/>
-        </w:tc>
-        <w:tc>
-          <w:tcPr>
-            <w:tcW w:type="dxa" w:w="2835"/>
+            <w:shd w:val="clear" w:color="auto" w:fill="F7F4FB"/>
           </w:tcPr>
           <w:p/>
         </w:tc>
@@ -1438,36 +2108,31 @@
       <w:pPr>
         <w:pStyle w:val="Heading1"/>
         <w:keepNext/>
-        <w:spacing w:before="320"/>
+        <w:spacing w:before="360" w:after="80"/>
       </w:pPr>
       <w:r>
         <w:rPr>
-          <w:color w:val="23262E"/>
+          <w:color w:val="4B2E83"/>
           <w:sz w:val="28"/>
         </w:rPr>
-        <w:t>Lo que el ejercicio le enseña al taller</w:t>
-      </w:r>
-    </w:p>
-    <w:p>
-      <w:pPr>
-        <w:keepNext/>
-        <w:spacing w:after="120"/>
-      </w:pPr>
-      <w:r>
-        <w:rPr>
-          <w:i/>
-          <w:color w:val="5D6371"/>
-        </w:rPr>
-        <w:t>Para el plenario, en pocas líneas. Pistas: ¿el objetivo revela un giro de enfoque? ¿las metas son comparables o hay que homologarlas? ¿hay evidencia de impacto o solo de gestión? ¿qué huecos tiene cada informe?</w:t>
+        <w:t>6. En términos de complejidad</w:t>
       </w:r>
     </w:p>
     <w:tbl>
       <w:tblPr>
         <w:tblStyle w:val="TableGrid"/>
         <w:tblW w:type="auto" w:w="0"/>
-        <w:jc w:val="center"/>
         <w:tblLayout w:type="fixed"/>
         <w:tblLook w:firstColumn="1" w:firstRow="1" w:lastColumn="0" w:lastRow="0" w:noHBand="0" w:noVBand="1" w:val="04A0"/>
+        <w:jc w:val="center"/>
+        <w:tblBorders>
+          <w:top w:val="single" w:sz="6" w:space="0" w:color="D7CBE7"/>
+          <w:left w:val="single" w:sz="6" w:space="0" w:color="D7CBE7"/>
+          <w:bottom w:val="single" w:sz="6" w:space="0" w:color="D7CBE7"/>
+          <w:right w:val="single" w:sz="6" w:space="0" w:color="D7CBE7"/>
+          <w:insideH w:val="single" w:sz="6" w:space="0" w:color="D7CBE7"/>
+          <w:insideV w:val="single" w:sz="6" w:space="0" w:color="D7CBE7"/>
+        </w:tblBorders>
       </w:tblPr>
       <w:tblGrid>
         <w:gridCol w:w="9972"/>
@@ -1479,7 +2144,7 @@
         <w:tc>
           <w:tcPr>
             <w:tcW w:type="dxa" w:w="9978"/>
-            <w:shd w:val="clear" w:color="auto" w:fill="ECEAFD"/>
+            <w:shd w:val="clear" w:color="auto" w:fill="4B2E83"/>
           </w:tcPr>
           <w:p>
             <w:pPr>
@@ -1489,8 +2154,22 @@
               <w:rPr>
                 <w:b/>
                 <w:i w:val="0"/>
+                <w:color w:val="FFFFFF"/>
               </w:rPr>
-              <w:t>Lo que el ejercicio le enseña al taller</w:t>
+              <w:t>Patrones que pueden emerger</w:t>
+            </w:r>
+          </w:p>
+          <w:p>
+            <w:pPr>
+              <w:keepNext/>
+            </w:pPr>
+            <w:r>
+              <w:rPr>
+                <w:i/>
+                <w:color w:val="FFFFFF"/>
+                <w:sz w:val="17"/>
+              </w:rPr>
+              <w:t>¿Qué podría verse al mirar juntas varias políticas que no se ve en una sola? Por ejemplo, instrumentos, entidades o recursos que comparten.</w:t>
             </w:r>
           </w:p>
         </w:tc>
@@ -1498,7 +2177,99 @@
       <w:tr>
         <w:trPr>
           <w:cantSplit/>
-          <w:trHeight w:val="3402" w:hRule="atLeast"/>
+          <w:trHeight w:val="2268" w:hRule="atLeast"/>
+        </w:trPr>
+        <w:tc>
+          <w:tcPr>
+            <w:tcW w:type="dxa" w:w="9978"/>
+          </w:tcPr>
+          <w:p>
+            <w:r>
+              <w:t>Sí: los beneficios tributarios y los fondos aparecen en varias políticas a la vez. Al juntarlas se vería si un mismo instrumento sostiene objetivos distintos.</w:t>
+            </w:r>
+          </w:p>
+        </w:tc>
+      </w:tr>
+    </w:tbl>
+    <w:p>
+      <w:pPr>
+        <w:spacing w:after="40"/>
+      </w:pPr>
+    </w:p>
+    <w:p>
+      <w:pPr>
+        <w:pStyle w:val="Heading1"/>
+        <w:keepNext/>
+        <w:spacing w:before="360" w:after="80"/>
+      </w:pPr>
+      <w:r>
+        <w:rPr>
+          <w:color w:val="4B2E83"/>
+          <w:sz w:val="28"/>
+        </w:rPr>
+        <w:t>7. Conclusiones</w:t>
+      </w:r>
+    </w:p>
+    <w:tbl>
+      <w:tblPr>
+        <w:tblStyle w:val="TableGrid"/>
+        <w:tblW w:type="auto" w:w="0"/>
+        <w:tblLayout w:type="fixed"/>
+        <w:tblLook w:firstColumn="1" w:firstRow="1" w:lastColumn="0" w:lastRow="0" w:noHBand="0" w:noVBand="1" w:val="04A0"/>
+        <w:jc w:val="center"/>
+        <w:tblBorders>
+          <w:top w:val="single" w:sz="6" w:space="0" w:color="D7CBE7"/>
+          <w:left w:val="single" w:sz="6" w:space="0" w:color="D7CBE7"/>
+          <w:bottom w:val="single" w:sz="6" w:space="0" w:color="D7CBE7"/>
+          <w:right w:val="single" w:sz="6" w:space="0" w:color="D7CBE7"/>
+          <w:insideH w:val="single" w:sz="6" w:space="0" w:color="D7CBE7"/>
+          <w:insideV w:val="single" w:sz="6" w:space="0" w:color="D7CBE7"/>
+        </w:tblBorders>
+      </w:tblPr>
+      <w:tblGrid>
+        <w:gridCol w:w="9972"/>
+      </w:tblGrid>
+      <w:tr>
+        <w:trPr>
+          <w:tblHeader/>
+        </w:trPr>
+        <w:tc>
+          <w:tcPr>
+            <w:tcW w:type="dxa" w:w="9978"/>
+            <w:shd w:val="clear" w:color="auto" w:fill="4B2E83"/>
+          </w:tcPr>
+          <w:p>
+            <w:pPr>
+              <w:keepNext/>
+            </w:pPr>
+            <w:r>
+              <w:rPr>
+                <w:b/>
+                <w:i w:val="0"/>
+                <w:color w:val="FFFFFF"/>
+              </w:rPr>
+              <w:t>Hallazgo principal</w:t>
+            </w:r>
+          </w:p>
+          <w:p>
+            <w:pPr>
+              <w:keepNext/>
+            </w:pPr>
+            <w:r>
+              <w:rPr>
+                <w:i/>
+                <w:color w:val="FFFFFF"/>
+                <w:sz w:val="17"/>
+              </w:rPr>
+              <w:t>¿Qué aprendimos que no era evidente al comienzo?</w:t>
+            </w:r>
+          </w:p>
+        </w:tc>
+      </w:tr>
+      <w:tr>
+        <w:trPr>
+          <w:cantSplit/>
+          <w:trHeight w:val="2835" w:hRule="atLeast"/>
         </w:trPr>
         <w:tc>
           <w:tcPr>
@@ -1529,38 +2300,24 @@
     </w:tbl>
     <w:p>
       <w:pPr>
-        <w:pStyle w:val="Heading1"/>
-        <w:keepNext/>
-        <w:spacing w:before="320"/>
+        <w:spacing w:after="40"/>
       </w:pPr>
-      <w:r>
-        <w:rPr>
-          <w:color w:val="23262E"/>
-          <w:sz w:val="28"/>
-        </w:rPr>
-        <w:t>Hipótesis para la sesión 2</w:t>
-      </w:r>
-    </w:p>
-    <w:p>
-      <w:pPr>
-        <w:keepNext/>
-        <w:spacing w:after="120"/>
-      </w:pPr>
-      <w:r>
-        <w:rPr>
-          <w:i/>
-          <w:color w:val="5D6371"/>
-        </w:rPr>
-        <w:t>¿Qué patrón creen que comparten las otras políticas? Se contrasta con el mapa integrado.</w:t>
-      </w:r>
     </w:p>
     <w:tbl>
       <w:tblPr>
         <w:tblStyle w:val="TableGrid"/>
         <w:tblW w:type="auto" w:w="0"/>
-        <w:jc w:val="center"/>
         <w:tblLayout w:type="fixed"/>
         <w:tblLook w:firstColumn="1" w:firstRow="1" w:lastColumn="0" w:lastRow="0" w:noHBand="0" w:noVBand="1" w:val="04A0"/>
+        <w:jc w:val="center"/>
+        <w:tblBorders>
+          <w:top w:val="single" w:sz="6" w:space="0" w:color="D7CBE7"/>
+          <w:left w:val="single" w:sz="6" w:space="0" w:color="D7CBE7"/>
+          <w:bottom w:val="single" w:sz="6" w:space="0" w:color="D7CBE7"/>
+          <w:right w:val="single" w:sz="6" w:space="0" w:color="D7CBE7"/>
+          <w:insideH w:val="single" w:sz="6" w:space="0" w:color="D7CBE7"/>
+          <w:insideV w:val="single" w:sz="6" w:space="0" w:color="D7CBE7"/>
+        </w:tblBorders>
       </w:tblPr>
       <w:tblGrid>
         <w:gridCol w:w="9972"/>
@@ -1572,7 +2329,7 @@
         <w:tc>
           <w:tcPr>
             <w:tcW w:type="dxa" w:w="9978"/>
-            <w:shd w:val="clear" w:color="auto" w:fill="ECEAFD"/>
+            <w:shd w:val="clear" w:color="auto" w:fill="4B2E83"/>
           </w:tcPr>
           <w:p>
             <w:pPr>
@@ -1582,8 +2339,22 @@
               <w:rPr>
                 <w:b/>
                 <w:i w:val="0"/>
+                <w:color w:val="FFFFFF"/>
               </w:rPr>
               <w:t>Hipótesis para la sesión 2</w:t>
+            </w:r>
+          </w:p>
+          <w:p>
+            <w:pPr>
+              <w:keepNext/>
+            </w:pPr>
+            <w:r>
+              <w:rPr>
+                <w:i/>
+                <w:color w:val="FFFFFF"/>
+                <w:sz w:val="17"/>
+              </w:rPr>
+              <w:t>¿Qué patrón creemos que podría repetirse en otras políticas?</w:t>
             </w:r>
           </w:p>
         </w:tc>
@@ -1591,7 +2362,7 @@
       <w:tr>
         <w:trPr>
           <w:cantSplit/>
-          <w:trHeight w:val="1984" w:hRule="atLeast"/>
+          <w:trHeight w:val="2268" w:hRule="atLeast"/>
         </w:trPr>
         <w:tc>
           <w:tcPr>
@@ -1605,6 +2376,11 @@
         </w:tc>
       </w:tr>
     </w:tbl>
+    <w:p>
+      <w:pPr>
+        <w:spacing w:after="40"/>
+      </w:pPr>
+    </w:p>
     <w:sectPr>
       <w:footerReference w:type="default" r:id="rId9"/>
       <w:pgSz w:w="12240" w:h="15840"/>
@@ -1628,7 +2404,7 @@
         <w:color w:val="5D6371"/>
         <w:sz w:val="16"/>
       </w:rPr>
-      <w:t xml:space="preserve">Laboratorio de Cocreación · Bitácora de grupo · v1 · página </w:t>
+      <w:t xml:space="preserve">Laboratorio de Cocreación · Bitácora de grupo · v4 · página </w:t>
     </w:r>
     <w:r>
       <w:rPr>

</xml_diff>